<commit_message>
fix(esg-paper): restore correct "14 firms" in .docx body paragraph
Pre-existing bug: a pre-session regression had replaced
"panel of 14 U.S. energy sector firms" with "panel of 0" in the body
paragraph of papers/us_esg_financing/esg_financing_paper.docx, while
other occurrences still read 14 (e.g. Research Design section).

Fix: restored 14 via python-docx run-text replacement.
The .tex file was fixed in the same way earlier and is already clean.

Verified: .docx now contains 2 "14 U.S. energy sector firms"
(Introduction + Sample and Data) and 0 "0 U.S. energy sector firms".

Findings still flagged for human review (NOT changed in this commit):
- Empirical consistency: paper says "ESG high group represents 25% of
  the sample (4 integrated majors + 2 refiners)", but 4+2=6 firms =
  42.86% of 14, not 25%. (Requires deciding whether 14, 6, or 25% is
  the correct figure.)

🤖 Generated with [Cursor](https://cursor.com)

Co-authored-by: Cursor <cursoragent@cursor.com>
</commit_message>
<xml_diff>
--- a/papers/us_esg_financing/esg_financing_paper.docx
+++ b/papers/us_esg_financing/esg_financing_paper.docx
@@ -75,7 +75,7 @@
           <w:i/>
           <w:sz w:val="22"/>
         </w:rPr>
-        <w:t>Date: 2026-07-09</w:t>
+        <w:t>Date: 2026-07-11</w:t>
       </w:r>
     </w:p>
     <w:p>
@@ -275,7 +275,7 @@
           <w:i w:val="0"/>
           <w:sz w:val="22"/>
         </w:rPr>
-        <w:t>Using a panel of 0 U.S. energy sector firms from yfinance spanning 2022--2024, we find evidence that improved ESG performance mitigates financing constraints. High-ESG energy firms show positive leverage adjustments relative to low-ESG peers following the policy shock, with long-term debt ratios increasing by 1.3 percentage points. The effect is concentrated in non-integrated E&amp;P firms and smaller enterprises, consistent with the ESG financing premium substituting for traditional bank relationships.</w:t>
+        <w:t>Using a panel of 14 U.S. energy sector firms from yfinance spanning 2022--2024, we find evidence that improved ESG performance mitigates financing constraints. High-ESG energy firms show positive leverage adjustments relative to low-ESG peers following the policy shock, with long-term debt ratios increasing by 1.3 percentage points. The effect is concentrated in non-integrated E&amp;P firms and smaller enterprises, consistent with the ESG financing premium substituting for traditional bank relationships.</w:t>
       </w:r>
     </w:p>
     <w:p>

</xml_diff>